<commit_message>
feat: Devivery 10th Oct
</commit_message>
<xml_diff>
--- a/納品物/テストキット/テスト実施手順書.docx
+++ b/納品物/テストキット/テスト実施手順書.docx
@@ -41,7 +41,7 @@
           <w:sz w:val="20"/>
           <w:szCs w:val="20"/>
         </w:rPr>
-        <w:t xml:space="preserve">作成日：2026年10月12日</w:t>
+        <w:t xml:space="preserve">作成日：2026年10月13日（受付番号判定の是正を反映）</w:t>
       </w:r>
     </w:p>
     <w:p>
@@ -220,7 +220,7 @@
                 <w:b w:val="false"/>
                 <w:bCs w:val="false"/>
               </w:rPr>
-              <w:t xml:space="preserve">5c29afe7a50251b43bb09a8531d8ca799b2c9d3fee1a91f9f481a17a5eedb69a</w:t>
+              <w:t xml:space="preserve">13c223f82ed067222e217e9e8b6073b1a30ccb85afe25bc61241f77ff0ae68fd</w:t>
             </w:r>
           </w:p>
         </w:tc>
@@ -346,7 +346,26 @@
           <w:b/>
           <w:bCs/>
         </w:rPr>
-        <w:t xml:space="preserve">本テストは、報告書記載の12パターンをローカルのテスト用フォームで再現し、修正版ツールの判定を確認するものです。送信先は 127.0.0.1（ご自身のPC内）のみで、実在企業・外部へは一切送信しません。</w:t>
+        <w:t xml:space="preserve">本テストは、報告書記載の15パターンをローカルのテスト用フォームで再現し、修正版ツールの判定を確認するものです。送信先は 127.0.0.1（ご自身のPC内）のみで、実在企業・外部へは一切送信しません。</w:t>
+      </w:r>
+    </w:p>
+    <w:p>
+      <w:pPr>
+        <w:pBdr>
+          <w:top w:val="single" w:color="BF9000" w:sz="6"/>
+          <w:left w:val="single" w:color="BF9000" w:sz="6"/>
+          <w:bottom w:val="single" w:color="BF9000" w:sz="6"/>
+          <w:right w:val="single" w:color="BF9000" w:sz="6"/>
+        </w:pBdr>
+        <w:shd w:fill="FFF2CC" w:color="auto" w:val="clear"/>
+        <w:spacing w:after="100" w:before="100"/>
+      </w:pPr>
+      <w:r>
+        <w:rPr>
+          <w:b/>
+          <w:bCs/>
+        </w:rPr>
+        <w:t xml:space="preserve">今回の修正点（/m・/n・/o）：『受付番号・問い合わせ番号』を受付確認の根拠とする場合、番号ラベルの語だけでは不可とし、実際の識別番号（数字を含む）が、かつ送信前には存在せず送信後に新規表示されたことを必須条件としました。あわせて、案内ページ・配信停止ページ等への遷移は受付確認として扱いません。/m・/n は受付確認にならず、実番号が新規表示された /o のみ受付確認となることをご確認いただけます。</w:t>
       </w:r>
     </w:p>
     <w:p>
@@ -367,7 +386,7 @@
         <w:spacing w:after="60"/>
       </w:pPr>
       <w:r>
-        <w:t xml:space="preserve">test_server.exe … テスト用フォームサーバ（起動すると http://127.0.0.1:8799 で12種のフォームを配信）</w:t>
+        <w:t xml:space="preserve">test_server.exe … テスト用フォームサーバ（起動すると http://127.0.0.1:8799 で15種のフォームを配信）</w:t>
       </w:r>
     </w:p>
     <w:p>
@@ -380,7 +399,7 @@
         <w:spacing w:after="60"/>
       </w:pPr>
       <w:r>
-        <w:t xml:space="preserve">テスト送信先.csv … 検証対象の12URL（すべて 127.0.0.1）</w:t>
+        <w:t xml:space="preserve">テスト送信先.csv … 検証対象の15URL（すべて 127.0.0.1）</w:t>
       </w:r>
     </w:p>
     <w:p>
@@ -495,7 +514,7 @@
         <w:spacing w:after="60"/>
       </w:pPr>
       <w:r>
-        <w:t xml:space="preserve">「開始」を押します。12件のテストフォームに対して順に処理が行われます。</w:t>
+        <w:t xml:space="preserve">「開始」を押します。15件のテストフォームに対して順に処理が行われます。</w:t>
       </w:r>
     </w:p>
     <w:p>
@@ -1474,6 +1493,219 @@
                 <w:bCs w:val="false"/>
               </w:rPr>
               <w:t xml:space="preserve">失敗</w:t>
+            </w:r>
+          </w:p>
+        </w:tc>
+      </w:tr>
+      <w:tr>
+        <w:tc>
+          <w:tcPr>
+            <w:tcW w:type="dxa" w:w="900"/>
+            <w:tcMar>
+              <w:top w:type="dxa" w:w="40"/>
+              <w:left w:type="dxa" w:w="80"/>
+              <w:bottom w:type="dxa" w:w="40"/>
+              <w:right w:type="dxa" w:w="80"/>
+            </w:tcMar>
+          </w:tcPr>
+          <w:p>
+            <w:pPr>
+              <w:jc w:val="left"/>
+            </w:pPr>
+            <w:r>
+              <w:rPr>
+                <w:b w:val="false"/>
+                <w:bCs w:val="false"/>
+              </w:rPr>
+              <w:t xml:space="preserve">/m</w:t>
+            </w:r>
+          </w:p>
+        </w:tc>
+        <w:tc>
+          <w:tcPr>
+            <w:tcW w:type="dxa" w:w="6300"/>
+            <w:tcMar>
+              <w:top w:type="dxa" w:w="40"/>
+              <w:left w:type="dxa" w:w="80"/>
+              <w:bottom w:type="dxa" w:w="40"/>
+              <w:right w:type="dxa" w:w="80"/>
+            </w:tcMar>
+          </w:tcPr>
+          <w:p>
+            <w:pPr>
+              <w:jc w:val="left"/>
+            </w:pPr>
+            <w:r>
+              <w:rPr>
+                <w:b w:val="false"/>
+                <w:bCs w:val="false"/>
+              </w:rPr>
+              <w:t xml:space="preserve">案内／保証ページへ遷移。受付番号の“語”のみで実番号なし＋完了文言＋フォーム消失</w:t>
+            </w:r>
+          </w:p>
+        </w:tc>
+        <w:tc>
+          <w:tcPr>
+            <w:tcW w:type="dxa" w:w="2600"/>
+            <w:tcMar>
+              <w:top w:type="dxa" w:w="40"/>
+              <w:left w:type="dxa" w:w="80"/>
+              <w:bottom w:type="dxa" w:w="40"/>
+              <w:right w:type="dxa" w:w="80"/>
+            </w:tcMar>
+          </w:tcPr>
+          <w:p>
+            <w:pPr>
+              <w:jc w:val="left"/>
+            </w:pPr>
+            <w:r>
+              <w:rPr>
+                <w:b w:val="false"/>
+                <w:bCs w:val="false"/>
+              </w:rPr>
+              <w:t xml:space="preserve">送信処理完了（推定）</w:t>
+            </w:r>
+          </w:p>
+        </w:tc>
+      </w:tr>
+      <w:tr>
+        <w:tc>
+          <w:tcPr>
+            <w:tcW w:type="dxa" w:w="900"/>
+            <w:tcMar>
+              <w:top w:type="dxa" w:w="40"/>
+              <w:left w:type="dxa" w:w="80"/>
+              <w:bottom w:type="dxa" w:w="40"/>
+              <w:right w:type="dxa" w:w="80"/>
+            </w:tcMar>
+          </w:tcPr>
+          <w:p>
+            <w:pPr>
+              <w:jc w:val="left"/>
+            </w:pPr>
+            <w:r>
+              <w:rPr>
+                <w:b w:val="false"/>
+                <w:bCs w:val="false"/>
+              </w:rPr>
+              <w:t xml:space="preserve">/n</w:t>
+            </w:r>
+          </w:p>
+        </w:tc>
+        <w:tc>
+          <w:tcPr>
+            <w:tcW w:type="dxa" w:w="6300"/>
+            <w:tcMar>
+              <w:top w:type="dxa" w:w="40"/>
+              <w:left w:type="dxa" w:w="80"/>
+              <w:bottom w:type="dxa" w:w="40"/>
+              <w:right w:type="dxa" w:w="80"/>
+            </w:tcMar>
+          </w:tcPr>
+          <w:p>
+            <w:pPr>
+              <w:jc w:val="left"/>
+            </w:pPr>
+            <w:r>
+              <w:rPr>
+                <w:b w:val="false"/>
+                <w:bCs w:val="false"/>
+              </w:rPr>
+              <w:t xml:space="preserve">配信停止／案内ページへ遷移。「管理番号」の語のみで実番号なし＋フォーム残存</w:t>
+            </w:r>
+          </w:p>
+        </w:tc>
+        <w:tc>
+          <w:tcPr>
+            <w:tcW w:type="dxa" w:w="2600"/>
+            <w:tcMar>
+              <w:top w:type="dxa" w:w="40"/>
+              <w:left w:type="dxa" w:w="80"/>
+              <w:bottom w:type="dxa" w:w="40"/>
+              <w:right w:type="dxa" w:w="80"/>
+            </w:tcMar>
+          </w:tcPr>
+          <w:p>
+            <w:pPr>
+              <w:jc w:val="left"/>
+            </w:pPr>
+            <w:r>
+              <w:rPr>
+                <w:b w:val="false"/>
+                <w:bCs w:val="false"/>
+              </w:rPr>
+              <w:t xml:space="preserve">送信処理完了（推定）</w:t>
+            </w:r>
+          </w:p>
+        </w:tc>
+      </w:tr>
+      <w:tr>
+        <w:tc>
+          <w:tcPr>
+            <w:tcW w:type="dxa" w:w="900"/>
+            <w:tcMar>
+              <w:top w:type="dxa" w:w="40"/>
+              <w:left w:type="dxa" w:w="80"/>
+              <w:bottom w:type="dxa" w:w="40"/>
+              <w:right w:type="dxa" w:w="80"/>
+            </w:tcMar>
+          </w:tcPr>
+          <w:p>
+            <w:pPr>
+              <w:jc w:val="left"/>
+            </w:pPr>
+            <w:r>
+              <w:rPr>
+                <w:b w:val="false"/>
+                <w:bCs w:val="false"/>
+              </w:rPr>
+              <w:t xml:space="preserve">/o</w:t>
+            </w:r>
+          </w:p>
+        </w:tc>
+        <w:tc>
+          <w:tcPr>
+            <w:tcW w:type="dxa" w:w="6300"/>
+            <w:tcMar>
+              <w:top w:type="dxa" w:w="40"/>
+              <w:left w:type="dxa" w:w="80"/>
+              <w:bottom w:type="dxa" w:w="40"/>
+              <w:right w:type="dxa" w:w="80"/>
+            </w:tcMar>
+          </w:tcPr>
+          <w:p>
+            <w:pPr>
+              <w:jc w:val="left"/>
+            </w:pPr>
+            <w:r>
+              <w:rPr>
+                <w:b w:val="false"/>
+                <w:bCs w:val="false"/>
+              </w:rPr>
+              <w:t xml:space="preserve">送信後に実際の受付番号（数字を含む）が新規表示＋フォーム消失</w:t>
+            </w:r>
+          </w:p>
+        </w:tc>
+        <w:tc>
+          <w:tcPr>
+            <w:tcW w:type="dxa" w:w="2600"/>
+            <w:tcMar>
+              <w:top w:type="dxa" w:w="40"/>
+              <w:left w:type="dxa" w:w="80"/>
+              <w:bottom w:type="dxa" w:w="40"/>
+              <w:right w:type="dxa" w:w="80"/>
+            </w:tcMar>
+          </w:tcPr>
+          <w:p>
+            <w:pPr>
+              <w:jc w:val="left"/>
+            </w:pPr>
+            <w:r>
+              <w:rPr>
+                <w:b w:val="false"/>
+                <w:bCs w:val="false"/>
+              </w:rPr>
+              <w:t xml:space="preserve">受付確認</w:t>
             </w:r>
           </w:p>
         </w:tc>

</xml_diff>